<commit_message>
KLimasimulation in Klimasimulation und Mystery getrennt
</commit_message>
<xml_diff>
--- a/klimasimulation/begleitheft.docx
+++ b/klimasimulation/begleitheft.docx
@@ -359,7 +359,7 @@
                 <w:sz w:val="18"/>
                 <w:szCs w:val="18"/>
               </w:rPr>
-              <w:t xml:space="preserve">jeder aktuelle Browser, auch offline; keine Anmeldung, keine Cookies</w:t>
+              <w:t xml:space="preserve">zwei eigenständige Anwendungen (Mystery und Klimasimulation); jeder aktuelle Browser, auch offline; keine Anmeldung, keine Cookies</w:t>
             </w:r>
           </w:p>
         </w:tc>
@@ -505,7 +505,7 @@
             <w:sz w:val="20"/>
             <w:szCs w:val="20"/>
           </w:rPr>
-          <w:t xml:space="preserve">Das Spiel im Kontrollraum</w:t>
+          <w:t xml:space="preserve">Die Klimasimulation im Kontrollraum</w:t>
         </w:r>
       </w:hyperlink>
     </w:p>
@@ -919,6 +919,59 @@
         <w:rPr>
           <w:rFonts w:ascii="Arial" w:cs="Arial" w:eastAsia="Arial" w:hAnsi="Arial"/>
         </w:rPr>
+        <w:t xml:space="preserve">Beide Lernwege liegen als eigenständige Anwendungen vor: das Mystery (Datei </w:t>
+      </w:r>
+      <w:r>
+        <w:rPr>
+          <w:rFonts w:ascii="Arial" w:cs="Arial" w:eastAsia="Arial" w:hAnsi="Arial"/>
+          <w:i/>
+          <w:iCs/>
+        </w:rPr>
+        <w:t xml:space="preserve">mystery.html</w:t>
+      </w:r>
+      <w:r>
+        <w:rPr>
+          <w:rFonts w:ascii="Arial" w:cs="Arial" w:eastAsia="Arial" w:hAnsi="Arial"/>
+        </w:rPr>
+        <w:t xml:space="preserve">) und die Klimasimulation (Datei </w:t>
+      </w:r>
+      <w:r>
+        <w:rPr>
+          <w:rFonts w:ascii="Arial" w:cs="Arial" w:eastAsia="Arial" w:hAnsi="Arial"/>
+          <w:i/>
+          <w:iCs/>
+        </w:rPr>
+        <w:t xml:space="preserve">klimasimulation.html</w:t>
+      </w:r>
+      <w:r>
+        <w:rPr>
+          <w:rFonts w:ascii="Arial" w:cs="Arial" w:eastAsia="Arial" w:hAnsi="Arial"/>
+        </w:rPr>
+        <w:t xml:space="preserve">). Sie bauen aufeinander auf, lassen sich aber auch einzeln oder an verschiedenen Tagen einsetzen. Die Startseite (</w:t>
+      </w:r>
+      <w:r>
+        <w:rPr>
+          <w:rFonts w:ascii="Arial" w:cs="Arial" w:eastAsia="Arial" w:hAnsi="Arial"/>
+          <w:i/>
+          <w:iCs/>
+        </w:rPr>
+        <w:t xml:space="preserve">index.html</w:t>
+      </w:r>
+      <w:r>
+        <w:rPr>
+          <w:rFonts w:ascii="Arial" w:cs="Arial" w:eastAsia="Arial" w:hAnsi="Arial"/>
+        </w:rPr>
+        <w:t xml:space="preserve">) führt zu beiden.</w:t>
+      </w:r>
+    </w:p>
+    <w:p>
+      <w:pPr>
+        <w:spacing w:after="120"/>
+      </w:pPr>
+      <w:r>
+        <w:rPr>
+          <w:rFonts w:ascii="Arial" w:cs="Arial" w:eastAsia="Arial" w:hAnsi="Arial"/>
+        </w:rPr>
         <w:t xml:space="preserve">Das Spiel steht in der Tradition von Frederic Vesters „Ökolopoly“: Alles hängt mit allem zusammen, Rückkopplungen verstärken sich, und manche Veränderungen lassen sich nicht mehr umkehren. Neu ist der planetare Maßstab. 24 verwundbare Elemente aus sechs Sphären liegen an ihrem realen Ort auf einer Weltkarte oder wahlweise auf einem drehbaren 3D-Globus, vom Grönländischen Eisschild bis zur Nordseeküste. 46 Wechselwirkungen verbinden sie.</w:t>
       </w:r>
     </w:p>
@@ -1010,7 +1063,7 @@
         <w:rPr>
           <w:rFonts w:ascii="Arial" w:cs="Arial" w:eastAsia="Arial" w:hAnsi="Arial"/>
         </w:rPr>
-        <w:t xml:space="preserve">Empfohlen sind zwei Doppelstunden. In einer einzelnen Doppelstunde lassen sich Mystery und Spiel kürzen: Die Gruppen spielen dann nur bis 2050, die Auswertung folgt in der nächsten Stunde.</w:t>
+        <w:t xml:space="preserve">Empfohlen sind zwei Doppelstunden. In einer einzelnen Doppelstunde lassen sich Mystery und Spiel kürzen: Die Gruppen spielen dann nur bis 2050, die Auswertung folgt in der nächsten Stunde. Weil Mystery und Klimasimulation getrennte Anwendungen sind, kann die zweite Doppelstunde auch Tage später folgen. Das Mystery eignet sich außerdem allein als Einstieg in eine Reihe zu Küsten und Meeresspiegel, die Klimasimulation allein als Abschluss einer Reihe zum Klimawandel.</w:t>
       </w:r>
     </w:p>
     <w:tbl>
@@ -1029,8 +1082,8 @@
       <w:tblGrid>
         <w:gridCol w:w="1254"/>
         <w:gridCol w:w="727"/>
-        <w:gridCol w:w="3440"/>
-        <w:gridCol w:w="4217"/>
+        <w:gridCol w:w="3296"/>
+        <w:gridCol w:w="4361"/>
       </w:tblGrid>
       <w:tr>
         <w:trPr>
@@ -1105,7 +1158,7 @@
         </w:tc>
         <w:tc>
           <w:tcPr>
-            <w:tcW w:type="dxa" w:w="3440"/>
+            <w:tcW w:type="dxa" w:w="3296"/>
             <w:tcBorders>
               <w:top w:val="single" w:color="C9CED8" w:sz="4"/>
               <w:left w:val="single" w:color="C9CED8" w:sz="4"/>
@@ -1138,7 +1191,7 @@
         </w:tc>
         <w:tc>
           <w:tcPr>
-            <w:tcW w:type="dxa" w:w="4217"/>
+            <w:tcW w:type="dxa" w:w="4361"/>
             <w:tcBorders>
               <w:top w:val="single" w:color="C9CED8" w:sz="4"/>
               <w:left w:val="single" w:color="C9CED8" w:sz="4"/>
@@ -1241,7 +1294,7 @@
         </w:tc>
         <w:tc>
           <w:tcPr>
-            <w:tcW w:type="dxa" w:w="3440"/>
+            <w:tcW w:type="dxa" w:w="3296"/>
             <w:tcBorders>
               <w:top w:val="single" w:color="C9CED8" w:sz="4"/>
               <w:left w:val="single" w:color="C9CED8" w:sz="4"/>
@@ -1273,7 +1326,7 @@
         </w:tc>
         <w:tc>
           <w:tcPr>
-            <w:tcW w:type="dxa" w:w="4217"/>
+            <w:tcW w:type="dxa" w:w="4361"/>
             <w:tcBorders>
               <w:top w:val="single" w:color="C9CED8" w:sz="4"/>
               <w:left w:val="single" w:color="C9CED8" w:sz="4"/>
@@ -1375,7 +1428,7 @@
         </w:tc>
         <w:tc>
           <w:tcPr>
-            <w:tcW w:type="dxa" w:w="3440"/>
+            <w:tcW w:type="dxa" w:w="3296"/>
             <w:tcBorders>
               <w:top w:val="single" w:color="C9CED8" w:sz="4"/>
               <w:left w:val="single" w:color="C9CED8" w:sz="4"/>
@@ -1407,7 +1460,7 @@
         </w:tc>
         <w:tc>
           <w:tcPr>
-            <w:tcW w:type="dxa" w:w="4217"/>
+            <w:tcW w:type="dxa" w:w="4361"/>
             <w:tcBorders>
               <w:top w:val="single" w:color="C9CED8" w:sz="4"/>
               <w:left w:val="single" w:color="C9CED8" w:sz="4"/>
@@ -1509,7 +1562,7 @@
         </w:tc>
         <w:tc>
           <w:tcPr>
-            <w:tcW w:type="dxa" w:w="3440"/>
+            <w:tcW w:type="dxa" w:w="3296"/>
             <w:tcBorders>
               <w:top w:val="single" w:color="C9CED8" w:sz="4"/>
               <w:left w:val="single" w:color="C9CED8" w:sz="4"/>
@@ -1541,7 +1594,7 @@
         </w:tc>
         <w:tc>
           <w:tcPr>
-            <w:tcW w:type="dxa" w:w="4217"/>
+            <w:tcW w:type="dxa" w:w="4361"/>
             <w:tcBorders>
               <w:top w:val="single" w:color="C9CED8" w:sz="4"/>
               <w:left w:val="single" w:color="C9CED8" w:sz="4"/>
@@ -1643,7 +1696,7 @@
         </w:tc>
         <w:tc>
           <w:tcPr>
-            <w:tcW w:type="dxa" w:w="3440"/>
+            <w:tcW w:type="dxa" w:w="3296"/>
             <w:tcBorders>
               <w:top w:val="single" w:color="C9CED8" w:sz="4"/>
               <w:left w:val="single" w:color="C9CED8" w:sz="4"/>
@@ -1675,7 +1728,7 @@
         </w:tc>
         <w:tc>
           <w:tcPr>
-            <w:tcW w:type="dxa" w:w="4217"/>
+            <w:tcW w:type="dxa" w:w="4361"/>
             <w:tcBorders>
               <w:top w:val="single" w:color="C9CED8" w:sz="4"/>
               <w:left w:val="single" w:color="C9CED8" w:sz="4"/>
@@ -1701,7 +1754,7 @@
                 <w:sz w:val="17"/>
                 <w:szCs w:val="17"/>
               </w:rPr>
-              <w:t xml:space="preserve">Zu Beginn die Steuerpult-Logik einmal gemeinsam zeigen. Pro Runde etwa 3–4 Minuten. Vor jeder Runde eine kurze Vorhersage notieren lassen.</w:t>
+              <w:t xml:space="preserve">Die Klimasimulation startet direkt; der Tür-Comic am Ende des Mysterys verlinkt sie. Zu Beginn die Steuerpult-Logik einmal gemeinsam zeigen. Pro Runde etwa 3–4 Minuten. Vor jeder Runde eine kurze Vorhersage notieren lassen.</w:t>
             </w:r>
           </w:p>
         </w:tc>
@@ -1777,7 +1830,7 @@
         </w:tc>
         <w:tc>
           <w:tcPr>
-            <w:tcW w:type="dxa" w:w="3440"/>
+            <w:tcW w:type="dxa" w:w="3296"/>
             <w:tcBorders>
               <w:top w:val="single" w:color="C9CED8" w:sz="4"/>
               <w:left w:val="single" w:color="C9CED8" w:sz="4"/>
@@ -1809,7 +1862,7 @@
         </w:tc>
         <w:tc>
           <w:tcPr>
-            <w:tcW w:type="dxa" w:w="4217"/>
+            <w:tcW w:type="dxa" w:w="4361"/>
             <w:tcBorders>
               <w:top w:val="single" w:color="C9CED8" w:sz="4"/>
               <w:left w:val="single" w:color="C9CED8" w:sz="4"/>
@@ -2009,13 +2062,46 @@
           <w:b/>
           <w:bCs/>
         </w:rPr>
+        <w:t xml:space="preserve">In der Anwendung:</w:t>
+      </w:r>
+      <w:r>
+        <w:rPr>
+          <w:rFonts w:ascii="Arial" w:cs="Arial" w:eastAsia="Arial" w:hAnsi="Arial"/>
+        </w:rPr>
+        <w:t xml:space="preserve"> Die Tür öffnet sich mit dem richtigen Codewort, mindestens sechs Kernideen und dem vollständigen Lösungssatz. Der Tür-Comic führt dann weiter zur Klimasimulation. Der Fortschritt bleibt im Browser des Geräts gespeichert, auch nach dem Neuladen. Mit </w:t>
+      </w:r>
+      <w:r>
+        <w:rPr>
+          <w:rFonts w:ascii="Arial" w:cs="Arial" w:eastAsia="Arial" w:hAnsi="Arial"/>
+          <w:b/>
+          <w:bCs/>
+        </w:rPr>
+        <w:t xml:space="preserve">„Neu beginnen“</w:t>
+      </w:r>
+      <w:r>
+        <w:rPr>
+          <w:rFonts w:ascii="Arial" w:cs="Arial" w:eastAsia="Arial" w:hAnsi="Arial"/>
+        </w:rPr>
+        <w:t xml:space="preserve"> (zweimal tippen) startet die nächste Gruppe mit leerem Brett.</w:t>
+      </w:r>
+    </w:p>
+    <w:p>
+      <w:pPr>
+        <w:spacing w:after="120"/>
+      </w:pPr>
+      <w:r>
+        <w:rPr>
+          <w:rFonts w:ascii="Arial" w:cs="Arial" w:eastAsia="Arial" w:hAnsi="Arial"/>
+          <w:b/>
+          <w:bCs/>
+        </w:rPr>
         <w:t xml:space="preserve">Methode:</w:t>
       </w:r>
       <w:r>
         <w:rPr>
           <w:rFonts w:ascii="Arial" w:cs="Arial" w:eastAsia="Arial" w:hAnsi="Arial"/>
         </w:rPr>
-        <w:t xml:space="preserve"> Ein Mystery verbindet zwei scheinbar unverbundene Sachverhalte, hier zwei Orte, durch eine Leitfrage. Die Gruppen ordnen 21 Informationskarten zu einem Wirkungsgefüge. Einige Karten sind wichtig, andere wahr, aber nebensächlich, und manche transportieren verbreitete Fehlvorstellungen. Es gibt nicht nur eine richtige Lösung: Das Spiel erkennt gleichwertige Verbindungen und gibt bei der Prüfung nur die Zahl der gefundenen Kernideen und Denkanstöße zurück, keine Bewertung einzelner Pfeile.</w:t>
+        <w:t xml:space="preserve"> Ein Mystery verbindet zwei scheinbar unverbundene Sachverhalte, hier zwei Orte, durch eine Leitfrage. Die Gruppen ordnen 21 Informationskarten zu einem Wirkungsgefüge. Einige Karten sind wichtig, andere wahr, aber nebensächlich, und manche transportieren verbreitete Fehlvorstellungen. Es gibt nicht nur eine richtige Lösung: Die Anwendung erkennt gleichwertige Verbindungen und gibt bei der Prüfung nur die Zahl der gefundenen Kernideen und Denkanstöße zurück, keine Bewertung einzelner Pfeile.</w:t>
       </w:r>
     </w:p>
     <w:p>
@@ -2039,7 +2125,7 @@
         <w:rPr>
           <w:rFonts w:ascii="Arial" w:cs="Arial" w:eastAsia="Arial" w:hAnsi="Arial"/>
         </w:rPr>
-        <w:t xml:space="preserve"> Die Lösungsskizze, die zehn Kernideen, das Codewort, den Lehrkraft-Code zum Überspringen und die Rolle jeder Karte enthält das </w:t>
+        <w:t xml:space="preserve"> Die Lösungsskizze, die zehn Kernideen, das Codewort, den Lehrkraft-Code, der die Tür ohne Lösung öffnet, und die Rolle jeder Karte enthält das </w:t>
       </w:r>
       <w:r>
         <w:rPr>
@@ -2218,7 +2304,7 @@
         <w:t xml:space="preserve">4  </w:t>
       </w:r>
       <w:r>
-        <w:t xml:space="preserve">Das Spiel im Kontrollraum</w:t>
+        <w:t xml:space="preserve">Die Klimasimulation im Kontrollraum</w:t>
       </w:r>
       <w:bookmarkEnd w:id="6"/>
     </w:p>
@@ -27067,7 +27153,49 @@
         <w:rPr>
           <w:rFonts w:ascii="Arial" w:cs="Arial" w:eastAsia="Arial" w:hAnsi="Arial"/>
         </w:rPr>
-        <w:t xml:space="preserve">Terra Vergo ist eine einzelne Webseite und läuft in jedem aktuellen Browser, auch ohne Internet. Es wird nichts installiert.</w:t>
+        <w:t xml:space="preserve">Terra Vergo besteht aus zwei eigenständigen Webseiten, dem Mystery (</w:t>
+      </w:r>
+      <w:r>
+        <w:rPr>
+          <w:rFonts w:ascii="Arial" w:cs="Arial" w:eastAsia="Arial" w:hAnsi="Arial"/>
+          <w:i/>
+          <w:iCs/>
+        </w:rPr>
+        <w:t xml:space="preserve">mystery.html</w:t>
+      </w:r>
+      <w:r>
+        <w:rPr>
+          <w:rFonts w:ascii="Arial" w:cs="Arial" w:eastAsia="Arial" w:hAnsi="Arial"/>
+        </w:rPr>
+        <w:t xml:space="preserve">) und der Klimasimulation (</w:t>
+      </w:r>
+      <w:r>
+        <w:rPr>
+          <w:rFonts w:ascii="Arial" w:cs="Arial" w:eastAsia="Arial" w:hAnsi="Arial"/>
+          <w:i/>
+          <w:iCs/>
+        </w:rPr>
+        <w:t xml:space="preserve">klimasimulation.html</w:t>
+      </w:r>
+      <w:r>
+        <w:rPr>
+          <w:rFonts w:ascii="Arial" w:cs="Arial" w:eastAsia="Arial" w:hAnsi="Arial"/>
+        </w:rPr>
+        <w:t xml:space="preserve">), dazu kommt eine Startseite (</w:t>
+      </w:r>
+      <w:r>
+        <w:rPr>
+          <w:rFonts w:ascii="Arial" w:cs="Arial" w:eastAsia="Arial" w:hAnsi="Arial"/>
+          <w:i/>
+          <w:iCs/>
+        </w:rPr>
+        <w:t xml:space="preserve">index.html</w:t>
+      </w:r>
+      <w:r>
+        <w:rPr>
+          <w:rFonts w:ascii="Arial" w:cs="Arial" w:eastAsia="Arial" w:hAnsi="Arial"/>
+        </w:rPr>
+        <w:t xml:space="preserve">). Jede Datei enthält alles, was sie braucht, und läuft für sich in jedem aktuellen Browser, auch ohne Internet. Es wird nichts installiert. Für den Einsatz ohne Internet genügt es, die benötigte Datei auf die Geräte zu kopieren.</w:t>
       </w:r>
     </w:p>
     <w:p>
@@ -27099,7 +27227,7 @@
         <w:rPr>
           <w:rFonts w:ascii="Arial" w:cs="Arial" w:eastAsia="Arial" w:hAnsi="Arial"/>
         </w:rPr>
-        <w:t xml:space="preserve">Es gibt keine Anmeldung, keine Cookies und keine Statistik. Nur der Fortschritt im Mystery und die gewählte Kartenansicht werden im Browser des Geräts gespeichert, damit ein Neuladen nichts löscht. Diese Daten verlassen das Gerät nicht und lassen sich über die Browsereinstellungen löschen.</w:t>
+        <w:t xml:space="preserve">Es gibt keine Anmeldung, keine Cookies und keine Statistik. Das Mystery speichert Karten, Pfeile und Lösungssatz im Browser des Geräts, die Klimasimulation nur die gewählte Kartenansicht, damit ein Neuladen nichts löscht. Diese Daten verlassen das Gerät nicht und lassen sich über die Browsereinstellungen löschen.</w:t>
       </w:r>
     </w:p>
     <w:p>
@@ -29160,7 +29288,7 @@
         </w:rPr>
         <w:t xml:space="preserve">IPCC (2023): AR6 Synthesis Report. Climate Change 2023. </w:t>
       </w:r>
-      <w:hyperlink w:history="1" r:id="rIdm6whdi_blsutcmbhlqcrn">
+      <w:hyperlink w:history="1" r:id="rIdmmazc-nyrldhlwo76elnd">
         <w:r>
           <w:rPr>
             <w:rStyle w:val="Hyperlink"/>
@@ -29179,7 +29307,7 @@
         </w:rPr>
         <w:t xml:space="preserve">; deutsche Hauptaussagen: </w:t>
       </w:r>
-      <w:hyperlink w:history="1" r:id="rIdwivd75vaabkwaohtz57rz">
+      <w:hyperlink w:history="1" r:id="rIdvwew-ctuhyqaltxsx9yq0">
         <w:r>
           <w:rPr>
             <w:rStyle w:val="Hyperlink"/>
@@ -29244,7 +29372,7 @@
         </w:rPr>
         <w:t xml:space="preserve">Wunderling, N. u. a. (2021): Interacting tipping elements increase risk of climate domino effects under global warming. Earth System Dynamics 12. </w:t>
       </w:r>
-      <w:hyperlink w:history="1" r:id="rIdr_fcuw9kwxmghsqhntrsu">
+      <w:hyperlink w:history="1" r:id="rIdt7gurhmzuwulbjx7wlo0u">
         <w:r>
           <w:rPr>
             <w:rStyle w:val="Hyperlink"/>
@@ -29273,7 +29401,7 @@
         </w:rPr>
         <w:t xml:space="preserve">Wunderling, N. u. a. (2024): Climate tipping point interactions and cascades: a review. Earth System Dynamics 15. </w:t>
       </w:r>
-      <w:hyperlink w:history="1" r:id="rIdyjpp5q-thess5c0dydvdw">
+      <w:hyperlink w:history="1" r:id="rIdefrsj-wfnosdyfzdnhs7m">
         <w:r>
           <w:rPr>
             <w:rStyle w:val="Hyperlink"/>
@@ -29392,7 +29520,7 @@
         </w:rPr>
         <w:t xml:space="preserve">Lenton, T. u. a. (2025): Global Tipping Points Report 2025. </w:t>
       </w:r>
-      <w:hyperlink w:history="1" r:id="rIdkwfvmgaovjxavmjmqxxas">
+      <w:hyperlink w:history="1" r:id="rIdas2ky48venlisl_ildqoz">
         <w:r>
           <w:rPr>
             <w:rStyle w:val="Hyperlink"/>
@@ -29619,7 +29747,7 @@
         </w:rPr>
         <w:t xml:space="preserve">DGfG (2020): Bildungsstandards im Fach Geographie für den Mittleren Schulabschluss, 10. Auflage. </w:t>
       </w:r>
-      <w:hyperlink w:history="1" r:id="rIdrfdtwdzmy04lamk4olvq3">
+      <w:hyperlink w:history="1" r:id="rIdqa3xr1mfa9v7nrrf9ygy6">
         <w:r>
           <w:rPr>
             <w:rStyle w:val="Hyperlink"/>
@@ -29648,7 +29776,7 @@
         </w:rPr>
         <w:t xml:space="preserve">DGfG (2024): Bildungsstandards im Fach Geographie für die Allgemeine Hochschulreife. </w:t>
       </w:r>
-      <w:hyperlink w:history="1" r:id="rIdrk5vw0qopr8r4jga75gex">
+      <w:hyperlink w:history="1" r:id="rIdhymruq3bsfh-dhzcxv5kl">
         <w:r>
           <w:rPr>
             <w:rStyle w:val="Hyperlink"/>
@@ -29713,7 +29841,7 @@
         </w:rPr>
         <w:t xml:space="preserve">Reinfried, S., Rottermann, B., Aeschbacher, U. und Huber, E. (2010): Alltagsvorstellungen über den Treibhauseffekt und die globale Erwärmung verändern – eine Voraussetzung für Bildung für nachhaltige Entwicklung. Schweizerische Zeitschrift für Bildungswissenschaften 32 (2). </w:t>
       </w:r>
-      <w:hyperlink w:history="1" r:id="rIdcpygzsdprkosvwhxskfr4">
+      <w:hyperlink w:history="1" r:id="rIdi3qaqwn9mg39ibu92_-iv">
         <w:r>
           <w:rPr>
             <w:rStyle w:val="Hyperlink"/>
@@ -29742,7 +29870,7 @@
         </w:rPr>
         <w:t xml:space="preserve">Sterman, J. und Sweeney, L. B. (2007): Understanding public complacency about climate change: adults' mental models of climate change violate conservation of matter. Climatic Change 80. </w:t>
       </w:r>
-      <w:hyperlink w:history="1" r:id="rId2szp5deojxwxgrcdxt5_0">
+      <w:hyperlink w:history="1" r:id="rIdntwdiyf4vstgsudq47kjf">
         <w:r>
           <w:rPr>
             <w:rStyle w:val="Hyperlink"/>
@@ -29771,7 +29899,7 @@
         </w:rPr>
         <w:t xml:space="preserve">Rempfler, A. und Uphues, R. (2012): System competence in geography education. Development of competence models, diagnosing pupils’ achievement. European Journal of Geography 3 (1). </w:t>
       </w:r>
-      <w:hyperlink w:history="1" r:id="rIdo1quo2gj_cjmd8u1-v2re">
+      <w:hyperlink w:history="1" r:id="rIdj_bjqxzh9tgwyvkq5u-_a">
         <w:r>
           <w:rPr>
             <w:rStyle w:val="Hyperlink"/>

</xml_diff>